<commit_message>
Test PMS templates offline with synthetic data, signatures and logos
</commit_message>
<xml_diff>
--- a/examples/pms/invoice.docx
+++ b/examples/pms/invoice.docx
@@ -6,7 +6,7 @@
       <w:r>
         <w:drawing>
           <wp:inline distT="0" distB="0" distL="0" distR="0">
-            <wp:extent cx="914400" cy="609600"/>
+            <wp:extent cx="1828800" cy="609600"/>
             <wp:docPr id="1" name="Picture 1" descr="{d.logo}"/>
             <a:graphic>
               <a:graphicData uri="http://schemas.openxmlformats.org/drawingml/2006/picture">
@@ -24,7 +24,7 @@
                   <pic:spPr>
                     <a:xfrm>
                       <a:off x="0" y="0"/>
-                      <a:ext cx="914400" cy="609600"/>
+                      <a:ext cx="1828800" cy="609600"/>
                     </a:xfrm>
                     <a:prstGeom prst="rect">
                       <a:avLst/>

</xml_diff>